<commit_message>
Deploying to gh-pages from @ Morrison-Lab/wai@d943037c3f68a59cd5d8eeaaae5a9d8f7b762d3e 🚀
</commit_message>
<xml_diff>
--- a/chapters/agent-architecture.docx
+++ b/chapters/agent-architecture.docx
@@ -15,7 +15,7 @@
         <w:pStyle w:val="Date"/>
       </w:pPr>
       <w:r>
-        <w:t xml:space="preserve">Last modified: 2026-09-24 10:39:15 (PDT)</w:t>
+        <w:t xml:space="preserve">Last modified: 2026-09-24 21:53:57 (PDT)</w:t>
       </w:r>
     </w:p>
     <w:p>
@@ -15799,7 +15799,7 @@
     </w:p>
     <w:bookmarkEnd w:id="132"/>
     <w:bookmarkEnd w:id="133"/>
-    <w:bookmarkStart w:id="182" w:name="sec-ai-opencode-ecosystem"/>
+    <w:bookmarkStart w:id="183" w:name="sec-ai-opencode-ecosystem"/>
     <w:p>
       <w:pPr>
         <w:pStyle w:val="Heading1"/>
@@ -18290,7 +18290,7 @@
       </w:r>
     </w:p>
     <w:bookmarkEnd w:id="163"/>
-    <w:bookmarkStart w:id="176" w:name="notable-clients-and-integrations"/>
+    <w:bookmarkStart w:id="177" w:name="notable-clients-and-integrations"/>
     <w:p>
       <w:pPr>
         <w:pStyle w:val="Heading4"/>
@@ -18514,64 +18514,87 @@
         <w:t xml:space="preserve"> </w:t>
       </w:r>
       <w:r>
+        <w:t xml:space="preserve">(</w:t>
+      </w:r>
+      <w:hyperlink r:id="rId166">
+        <w:r>
+          <w:rPr>
+            <w:rStyle w:val="Hyperlink"/>
+          </w:rPr>
+          <w:t xml:space="preserve">GitHub</w:t>
+        </w:r>
+      </w:hyperlink>
+      <w:r>
+        <w:t xml:space="preserve">)</w:t>
+      </w:r>
+      <w:r>
+        <w:t xml:space="preserve"> </w:t>
+      </w:r>
+      <w:r>
         <w:t xml:space="preserve">(OpenChamber 2026)</w:t>
       </w:r>
       <w:r>
         <w:t xml:space="preserve"> </w:t>
       </w:r>
       <w:r>
-        <w:t xml:space="preserve">(now under its own organization; MIT; about 9,700 stars; release</w:t>
-      </w:r>
-      <w:r>
-        <w:t xml:space="preserve"> </w:t>
-      </w:r>
-      <w:r>
-        <w:rPr>
-          <w:rStyle w:val="VerbatimChar"/>
-        </w:rPr>
-        <w:t xml:space="preserve">v1.22.2</w:t>
-      </w:r>
-      <w:r>
-        <w:t xml:space="preserve"> </w:t>
-      </w:r>
-      <w:r>
-        <w:t xml:space="preserve">on 2026-09-05).</w:t>
-      </w:r>
-      <w:r>
-        <w:t xml:space="preserve"> </w:t>
-      </w:r>
-      <w:r>
-        <w:t xml:space="preserve">A workspace for running and reviewing agent work on desktop, web, VS Code, iOS, and Android,</w:t>
-      </w:r>
-      <w:r>
-        <w:t xml:space="preserve"> </w:t>
-      </w:r>
-      <w:r>
-        <w:t xml:space="preserve">with session goals, a</w:t>
-      </w:r>
-      <w:r>
-        <w:t xml:space="preserve"> </w:t>
-      </w:r>
-      <w:r>
-        <w:t xml:space="preserve">“multi-run”</w:t>
-      </w:r>
-      <w:r>
-        <w:t xml:space="preserve"> </w:t>
-      </w:r>
-      <w:r>
-        <w:t xml:space="preserve">mode that runs the same task across up to five models,</w:t>
-      </w:r>
-      <w:r>
-        <w:t xml:space="preserve"> </w:t>
-      </w:r>
-      <w:r>
-        <w:t xml:space="preserve">a guided changes walkthrough for large diffs, scheduled tasks,</w:t>
-      </w:r>
-      <w:r>
-        <w:t xml:space="preserve"> </w:t>
-      </w:r>
-      <w:r>
-        <w:t xml:space="preserve">and an end-to-end encrypted</w:t>
+        <w:t xml:space="preserve">(now under its own organization; MIT; post-survey update as of 2026-09-24: about 10,500 stars; release</w:t>
+      </w:r>
+      <w:r>
+        <w:t xml:space="preserve"> </w:t>
+      </w:r>
+      <w:r>
+        <w:rPr>
+          <w:rStyle w:val="VerbatimChar"/>
+        </w:rPr>
+        <w:t xml:space="preserve">v2.0.1</w:t>
+      </w:r>
+      <w:r>
+        <w:t xml:space="preserve">).</w:t>
+      </w:r>
+      <w:r>
+        <w:t xml:space="preserve"> </w:t>
+      </w:r>
+      <w:r>
+        <w:t xml:space="preserve">An agentic development environment built on top of the OpenCode SDK.</w:t>
+      </w:r>
+      <w:r>
+        <w:t xml:space="preserve"> </w:t>
+      </w:r>
+      <w:r>
+        <w:t xml:space="preserve">It splits execution across a self-hosted instance (</w:t>
+      </w:r>
+      <w:r>
+        <w:rPr>
+          <w:rStyle w:val="VerbatimChar"/>
+        </w:rPr>
+        <w:t xml:space="preserve">openchamber</w:t>
+      </w:r>
+      <w:r>
+        <w:t xml:space="preserve">) running on a machine you control</w:t>
+      </w:r>
+      <w:r>
+        <w:t xml:space="preserve"> </w:t>
+      </w:r>
+      <w:r>
+        <w:t xml:space="preserve">(local workstation, Linux box, or server) and client interfaces across desktop apps</w:t>
+      </w:r>
+      <w:r>
+        <w:t xml:space="preserve"> </w:t>
+      </w:r>
+      <w:r>
+        <w:t xml:space="preserve">(macOS, Windows, Linux, and editor integrations across VS Code, Cursor, Windsurf, and Trae),</w:t>
+      </w:r>
+      <w:r>
+        <w:t xml:space="preserve"> </w:t>
+      </w:r>
+      <w:r>
+        <w:t xml:space="preserve">browsers, and mobile (iOS beta, Android, and PWA).</w:t>
+      </w:r>
+      <w:r>
+        <w:t xml:space="preserve"> </w:t>
+      </w:r>
+      <w:r>
+        <w:t xml:space="preserve">Remote connectivity uses an end-to-end encrypted</w:t>
       </w:r>
       <w:r>
         <w:t xml:space="preserve"> </w:t>
@@ -18583,13 +18606,43 @@
         <w:t xml:space="preserve"> </w:t>
       </w:r>
       <w:r>
-        <w:t xml:space="preserve">for remote connections.</w:t>
-      </w:r>
-      <w:r>
-        <w:t xml:space="preserve"> </w:t>
-      </w:r>
-      <w:r>
-        <w:t xml:space="preserve">Like CodeNomad it uses OpenCode as the engine and is not affiliated with the OpenCode team.</w:t>
+        <w:t xml:space="preserve">paired via QR code</w:t>
+      </w:r>
+      <w:r>
+        <w:t xml:space="preserve"> </w:t>
+      </w:r>
+      <w:r>
+        <w:t xml:space="preserve">without exposing inbound ports or maintaining public tunnels.</w:t>
+      </w:r>
+      <w:r>
+        <w:t xml:space="preserve"> </w:t>
+      </w:r>
+      <w:r>
+        <w:t xml:space="preserve">Users can start sessions from GitHub issues/PRs or Linear tickets with session goals and recurring schedules,</w:t>
+      </w:r>
+      <w:r>
+        <w:t xml:space="preserve"> </w:t>
+      </w:r>
+      <w:r>
+        <w:t xml:space="preserve">run tasks across up to five models in parallel (each in its own session, with optional worktree isolation per the repository README)</w:t>
+      </w:r>
+      <w:r>
+        <w:t xml:space="preserve"> </w:t>
+      </w:r>
+      <w:r>
+        <w:t xml:space="preserve">with interactive browser verification and multi-model fusion,</w:t>
+      </w:r>
+      <w:r>
+        <w:t xml:space="preserve"> </w:t>
+      </w:r>
+      <w:r>
+        <w:t xml:space="preserve">and inspect changes through ordered diff walkthroughs while attaching failed CI checks or review comments directly to the agent’s chat context.</w:t>
+      </w:r>
+      <w:r>
+        <w:t xml:space="preserve"> </w:t>
+      </w:r>
+      <w:r>
+        <w:t xml:space="preserve">Like CodeNomad it uses OpenCode as the underlying engine and is not affiliated with the OpenCode team.</w:t>
       </w:r>
       <w:r>
         <w:t xml:space="preserve"> </w:t>
@@ -18605,7 +18658,13 @@
         <w:t xml:space="preserve"> </w:t>
       </w:r>
       <w:r>
-        <w:t xml:space="preserve">Yes; the multi-model run is a direct fit for our habit of getting a second model’s review.</w:t>
+        <w:t xml:space="preserve">Yes; the multi-model parallel run and worktree isolation mirror our own practices,</w:t>
+      </w:r>
+      <w:r>
+        <w:t xml:space="preserve"> </w:t>
+      </w:r>
+      <w:r>
+        <w:t xml:space="preserve">and Private Relay enables headless server agent monitoring from mobile or browser without exposing ports.</w:t>
       </w:r>
     </w:p>
     <w:p>
@@ -18616,7 +18675,7 @@
           <w:numId w:val="1032"/>
         </w:numPr>
       </w:pPr>
-      <w:hyperlink r:id="rId166">
+      <w:hyperlink r:id="rId167">
         <w:r>
           <w:rPr>
             <w:rStyle w:val="VerbatimChar"/>
@@ -18745,7 +18804,7 @@
       <w:r>
         <w:t xml:space="preserve"> </w:t>
       </w:r>
-      <w:hyperlink r:id="rId167">
+      <w:hyperlink r:id="rId168">
         <w:r>
           <w:rPr>
             <w:rStyle w:val="Hyperlink"/>
@@ -18771,7 +18830,7 @@
           <w:numId w:val="1032"/>
         </w:numPr>
       </w:pPr>
-      <w:hyperlink r:id="rId168">
+      <w:hyperlink r:id="rId169">
         <w:r>
           <w:rPr>
             <w:rStyle w:val="VerbatimChar"/>
@@ -18848,7 +18907,7 @@
       <w:r>
         <w:t xml:space="preserve"> </w:t>
       </w:r>
-      <w:hyperlink r:id="rId169">
+      <w:hyperlink r:id="rId170">
         <w:r>
           <w:rPr>
             <w:rStyle w:val="VerbatimChar"/>
@@ -18887,7 +18946,7 @@
           <w:numId w:val="1032"/>
         </w:numPr>
       </w:pPr>
-      <w:hyperlink r:id="rId170">
+      <w:hyperlink r:id="rId171">
         <w:r>
           <w:rPr>
             <w:rStyle w:val="VerbatimChar"/>
@@ -18974,7 +19033,7 @@
           <w:numId w:val="1032"/>
         </w:numPr>
       </w:pPr>
-      <w:hyperlink r:id="rId171">
+      <w:hyperlink r:id="rId172">
         <w:r>
           <w:rPr>
             <w:rStyle w:val="VerbatimChar"/>
@@ -19006,7 +19065,7 @@
       <w:r>
         <w:t xml:space="preserve"> </w:t>
       </w:r>
-      <w:hyperlink r:id="rId172">
+      <w:hyperlink r:id="rId173">
         <w:r>
           <w:rPr>
             <w:rStyle w:val="VerbatimChar"/>
@@ -19051,7 +19110,7 @@
           <w:numId w:val="1032"/>
         </w:numPr>
       </w:pPr>
-      <w:hyperlink r:id="rId173">
+      <w:hyperlink r:id="rId174">
         <w:r>
           <w:rPr>
             <w:rStyle w:val="VerbatimChar"/>
@@ -19200,7 +19259,7 @@
           <w:numId w:val="1032"/>
         </w:numPr>
       </w:pPr>
-      <w:hyperlink r:id="rId174">
+      <w:hyperlink r:id="rId175">
         <w:r>
           <w:rPr>
             <w:rStyle w:val="VerbatimChar"/>
@@ -19223,7 +19282,7 @@
       <w:r>
         <w:t xml:space="preserve"> </w:t>
       </w:r>
-      <w:hyperlink r:id="rId175">
+      <w:hyperlink r:id="rId176">
         <w:r>
           <w:rPr>
             <w:rStyle w:val="VerbatimChar"/>
@@ -19260,8 +19319,8 @@
         <w:t xml:space="preserve">Only when building on the SDK.</w:t>
       </w:r>
     </w:p>
-    <w:bookmarkEnd w:id="176"/>
-    <w:bookmarkStart w:id="179" w:name="agent-bundles"/>
+    <w:bookmarkEnd w:id="177"/>
+    <w:bookmarkStart w:id="180" w:name="agent-bundles"/>
     <w:p>
       <w:pPr>
         <w:pStyle w:val="Heading4"/>
@@ -19278,7 +19337,7 @@
           <w:numId w:val="1033"/>
         </w:numPr>
       </w:pPr>
-      <w:hyperlink r:id="rId177">
+      <w:hyperlink r:id="rId178">
         <w:r>
           <w:rPr>
             <w:rStyle w:val="VerbatimChar"/>
@@ -19334,7 +19393,7 @@
           <w:numId w:val="1033"/>
         </w:numPr>
       </w:pPr>
-      <w:hyperlink r:id="rId178">
+      <w:hyperlink r:id="rId179">
         <w:r>
           <w:rPr>
             <w:rStyle w:val="VerbatimChar"/>
@@ -19405,8 +19464,8 @@
         <w:t xml:space="preserve">pick one such harness rather than layering them.</w:t>
       </w:r>
     </w:p>
-    <w:bookmarkEnd w:id="179"/>
-    <w:bookmarkStart w:id="180" w:name="opencode-zen-and-opencode-go"/>
+    <w:bookmarkEnd w:id="180"/>
+    <w:bookmarkStart w:id="181" w:name="opencode-zen-and-opencode-go"/>
     <w:p>
       <w:pPr>
         <w:pStyle w:val="Heading4"/>
@@ -19646,8 +19705,8 @@
         <w:t xml:space="preserve">).</w:t>
       </w:r>
     </w:p>
-    <w:bookmarkEnd w:id="180"/>
-    <w:bookmarkStart w:id="181" w:name="summary"/>
+    <w:bookmarkEnd w:id="181"/>
+    <w:bookmarkStart w:id="182" w:name="summary"/>
     <w:p>
       <w:pPr>
         <w:pStyle w:val="Heading4"/>
@@ -20061,9 +20120,9 @@
         <w:t xml:space="preserve">Skip the subscription-bridge plugins.</w:t>
       </w:r>
     </w:p>
-    <w:bookmarkEnd w:id="181"/>
     <w:bookmarkEnd w:id="182"/>
-    <w:bookmarkStart w:id="192" w:name="sec-ai-voltagent"/>
+    <w:bookmarkEnd w:id="183"/>
+    <w:bookmarkStart w:id="193" w:name="sec-ai-voltagent"/>
     <w:p>
       <w:pPr>
         <w:pStyle w:val="Heading1"/>
@@ -20076,7 +20135,7 @@
       <w:pPr>
         <w:pStyle w:val="FirstParagraph"/>
       </w:pPr>
-      <w:hyperlink r:id="rId183">
+      <w:hyperlink r:id="rId184">
         <w:r>
           <w:rPr>
             <w:rStyle w:val="Hyperlink"/>
@@ -20154,7 +20213,7 @@
         <w:t xml:space="preserve">so it is young but actively maintained.</w:t>
       </w:r>
     </w:p>
-    <w:bookmarkStart w:id="187" w:name="how-agents-are-expressed"/>
+    <w:bookmarkStart w:id="188" w:name="how-agents-are-expressed"/>
     <w:p>
       <w:pPr>
         <w:pStyle w:val="Heading4"/>
@@ -20438,7 +20497,7 @@
       <w:r>
         <w:t xml:space="preserve"> </w:t>
       </w:r>
-      <w:hyperlink r:id="rId184">
+      <w:hyperlink r:id="rId185">
         <w:r>
           <w:rPr>
             <w:rStyle w:val="Hyperlink"/>
@@ -20628,7 +20687,7 @@
       <w:r>
         <w:t xml:space="preserve"> </w:t>
       </w:r>
-      <w:hyperlink r:id="rId185">
+      <w:hyperlink r:id="rId186">
         <w:r>
           <w:rPr>
             <w:rStyle w:val="Hyperlink"/>
@@ -21129,7 +21188,7 @@
       <w:r>
         <w:t xml:space="preserve"> </w:t>
       </w:r>
-      <w:hyperlink r:id="rId186">
+      <w:hyperlink r:id="rId187">
         <w:r>
           <w:rPr>
             <w:rStyle w:val="Hyperlink"/>
@@ -21159,8 +21218,8 @@
         <w:t xml:space="preserve">.</w:t>
       </w:r>
     </w:p>
-    <w:bookmarkEnd w:id="187"/>
-    <w:bookmarkStart w:id="188" w:name="observability-and-hosted-parts"/>
+    <w:bookmarkEnd w:id="188"/>
+    <w:bookmarkStart w:id="189" w:name="observability-and-hosted-parts"/>
     <w:p>
       <w:pPr>
         <w:pStyle w:val="Heading4"/>
@@ -21485,8 +21544,8 @@
         <w:t xml:space="preserve">even though the framework around them is MIT-licensed.</w:t>
       </w:r>
     </w:p>
-    <w:bookmarkEnd w:id="188"/>
-    <w:bookmarkStart w:id="191" w:name="useful-to-us"/>
+    <w:bookmarkEnd w:id="189"/>
+    <w:bookmarkStart w:id="192" w:name="useful-to-us"/>
     <w:p>
       <w:pPr>
         <w:pStyle w:val="Heading4"/>
@@ -21508,7 +21567,7 @@
       <w:r>
         <w:t xml:space="preserve">Our orchestration baseline (</w:t>
       </w:r>
-      <w:hyperlink r:id="rId189">
+      <w:hyperlink r:id="rId190">
         <w:r>
           <w:rPr>
             <w:rStyle w:val="Hyperlink"/>
@@ -21775,7 +21834,7 @@
       <w:r>
         <w:t xml:space="preserve"> </w:t>
       </w:r>
-      <w:hyperlink r:id="rId190">
+      <w:hyperlink r:id="rId191">
         <w:r>
           <w:rPr>
             <w:rStyle w:val="Hyperlink"/>
@@ -21878,9 +21937,9 @@
         <w:t xml:space="preserve">in one Node process.</w:t>
       </w:r>
     </w:p>
-    <w:bookmarkEnd w:id="191"/>
     <w:bookmarkEnd w:id="192"/>
-    <w:bookmarkStart w:id="202" w:name="sec-ai-anthropic-repos"/>
+    <w:bookmarkEnd w:id="193"/>
+    <w:bookmarkStart w:id="203" w:name="sec-ai-anthropic-repos"/>
     <w:p>
       <w:pPr>
         <w:pStyle w:val="Heading1"/>
@@ -21899,7 +21958,7 @@
       <w:r>
         <w:t xml:space="preserve"> </w:t>
       </w:r>
-      <w:hyperlink r:id="rId193">
+      <w:hyperlink r:id="rId194">
         <w:r>
           <w:rPr>
             <w:rStyle w:val="VerbatimChar"/>
@@ -22153,7 +22212,7 @@
         <w:t xml:space="preserve">while its README says four of its skills are source-available.</w:t>
       </w:r>
     </w:p>
-    <w:bookmarkStart w:id="195" w:name="which-repositories-matter-to-us"/>
+    <w:bookmarkStart w:id="196" w:name="which-repositories-matter-to-us"/>
     <w:p>
       <w:pPr>
         <w:pStyle w:val="Heading4"/>
@@ -23280,7 +23339,7 @@
             <w:r>
               <w:t xml:space="preserve"> </w:t>
             </w:r>
-            <w:hyperlink r:id="rId194">
+            <w:hyperlink r:id="rId195">
               <w:r>
                 <w:rPr>
                   <w:rStyle w:val="Hyperlink"/>
@@ -24484,8 +24543,8 @@
         <w:t xml:space="preserve">(measured 2026-09-09).</w:t>
       </w:r>
     </w:p>
-    <w:bookmarkEnd w:id="195"/>
-    <w:bookmarkStart w:id="197" w:name="X417fba8867cffb00916d87d19d41ed8ba04a527"/>
+    <w:bookmarkEnd w:id="196"/>
+    <w:bookmarkStart w:id="198" w:name="X417fba8867cffb00916d87d19d41ed8ba04a527"/>
     <w:p>
       <w:pPr>
         <w:pStyle w:val="Heading4"/>
@@ -25153,7 +25212,7 @@
       <w:r>
         <w:t xml:space="preserve"> </w:t>
       </w:r>
-      <w:hyperlink r:id="rId196">
+      <w:hyperlink r:id="rId197">
         <w:r>
           <w:rPr>
             <w:rStyle w:val="Hyperlink"/>
@@ -25342,8 +25401,8 @@
         <w:t xml:space="preserve">nothing in this repository lets you read them.</w:t>
       </w:r>
     </w:p>
-    <w:bookmarkEnd w:id="197"/>
-    <w:bookmarkStart w:id="199" w:name="X06cf6cae705336442e9e13e0c5dca357781aab3"/>
+    <w:bookmarkEnd w:id="198"/>
+    <w:bookmarkStart w:id="200" w:name="X06cf6cae705336442e9e13e0c5dca357781aab3"/>
     <w:p>
       <w:pPr>
         <w:pStyle w:val="Heading4"/>
@@ -25448,7 +25507,7 @@
       <w:pPr>
         <w:pStyle w:val="BodyText"/>
       </w:pPr>
-      <w:hyperlink r:id="rId198">
+      <w:hyperlink r:id="rId199">
         <w:r>
           <w:rPr>
             <w:rStyle w:val="Hyperlink"/>
@@ -26195,8 +26254,8 @@
         <w:t xml:space="preserve">.</w:t>
       </w:r>
     </w:p>
-    <w:bookmarkEnd w:id="199"/>
-    <w:bookmarkStart w:id="200" w:name="X28851fad5780a316e2bc5d8f9171299713117f5"/>
+    <w:bookmarkEnd w:id="200"/>
+    <w:bookmarkStart w:id="201" w:name="X28851fad5780a316e2bc5d8f9171299713117f5"/>
     <w:p>
       <w:pPr>
         <w:pStyle w:val="Heading4"/>
@@ -26576,7 +26635,7 @@
       <w:r>
         <w:t xml:space="preserve">built for Claude Cowork (</w:t>
       </w:r>
-      <w:hyperlink r:id="rId167">
+      <w:hyperlink r:id="rId168">
         <w:r>
           <w:rPr>
             <w:rStyle w:val="Hyperlink"/>
@@ -26913,8 +26972,8 @@
         <w:t xml:space="preserve">so Windows users in the lab should treat it as experimental.</w:t>
       </w:r>
     </w:p>
-    <w:bookmarkEnd w:id="200"/>
-    <w:bookmarkStart w:id="201" w:name="useful-to-us-1"/>
+    <w:bookmarkEnd w:id="201"/>
+    <w:bookmarkStart w:id="202" w:name="useful-to-us-1"/>
     <w:p>
       <w:pPr>
         <w:pStyle w:val="Heading4"/>
@@ -26979,7 +27038,7 @@
       <w:r>
         <w:t xml:space="preserve"> </w:t>
       </w:r>
-      <w:hyperlink r:id="rId198">
+      <w:hyperlink r:id="rId199">
         <w:r>
           <w:rPr>
             <w:rStyle w:val="Hyperlink"/>
@@ -27293,7 +27352,7 @@
       <w:r>
         <w:t xml:space="preserve"> </w:t>
       </w:r>
-      <w:hyperlink r:id="rId196">
+      <w:hyperlink r:id="rId197">
         <w:r>
           <w:rPr>
             <w:rStyle w:val="Hyperlink"/>
@@ -27363,9 +27422,9 @@
         <w:t xml:space="preserve">which is not the lab’s main use of Claude.</w:t>
       </w:r>
     </w:p>
-    <w:bookmarkEnd w:id="201"/>
     <w:bookmarkEnd w:id="202"/>
-    <w:bookmarkStart w:id="318" w:name="references"/>
+    <w:bookmarkEnd w:id="203"/>
+    <w:bookmarkStart w:id="319" w:name="references"/>
     <w:p>
       <w:pPr>
         <w:pStyle w:val="Heading1"/>
@@ -27374,8 +27433,8 @@
         <w:t xml:space="preserve">References</w:t>
       </w:r>
     </w:p>
-    <w:bookmarkStart w:id="317" w:name="refs"/>
-    <w:bookmarkStart w:id="203" w:name="ref-opencode_codex_auth"/>
+    <w:bookmarkStart w:id="318" w:name="refs"/>
+    <w:bookmarkStart w:id="204" w:name="ref-opencode_codex_auth"/>
     <w:p>
       <w:pPr>
         <w:pStyle w:val="Bibliography"/>
@@ -27411,8 +27470,8 @@
         <w:t xml:space="preserve">.</w:t>
       </w:r>
     </w:p>
-    <w:bookmarkEnd w:id="203"/>
-    <w:bookmarkStart w:id="205" w:name="ref-opencode_repo"/>
+    <w:bookmarkEnd w:id="204"/>
+    <w:bookmarkStart w:id="206" w:name="ref-opencode_repo"/>
     <w:p>
       <w:pPr>
         <w:pStyle w:val="Bibliography"/>
@@ -27439,7 +27498,7 @@
       <w:r>
         <w:t xml:space="preserve"> </w:t>
       </w:r>
-      <w:hyperlink r:id="rId204">
+      <w:hyperlink r:id="rId205">
         <w:r>
           <w:rPr>
             <w:rStyle w:val="Hyperlink"/>
@@ -27451,8 +27510,8 @@
         <w:t xml:space="preserve">.</w:t>
       </w:r>
     </w:p>
-    <w:bookmarkEnd w:id="205"/>
-    <w:bookmarkStart w:id="207" w:name="ref-claude_agent_sdk_overview"/>
+    <w:bookmarkEnd w:id="206"/>
+    <w:bookmarkStart w:id="208" w:name="ref-claude_agent_sdk_overview"/>
     <w:p>
       <w:pPr>
         <w:pStyle w:val="Bibliography"/>
@@ -27476,7 +27535,7 @@
       <w:r>
         <w:t xml:space="preserve"> </w:t>
       </w:r>
-      <w:hyperlink r:id="rId206">
+      <w:hyperlink r:id="rId207">
         <w:r>
           <w:rPr>
             <w:rStyle w:val="Hyperlink"/>
@@ -27488,8 +27547,8 @@
         <w:t xml:space="preserve">.</w:t>
       </w:r>
     </w:p>
-    <w:bookmarkEnd w:id="207"/>
-    <w:bookmarkStart w:id="209" w:name="ref-anthropics_anthropic_sdk_python"/>
+    <w:bookmarkEnd w:id="208"/>
+    <w:bookmarkStart w:id="210" w:name="ref-anthropics_anthropic_sdk_python"/>
     <w:p>
       <w:pPr>
         <w:pStyle w:val="Bibliography"/>
@@ -27513,7 +27572,7 @@
       <w:r>
         <w:t xml:space="preserve"> </w:t>
       </w:r>
-      <w:hyperlink r:id="rId208">
+      <w:hyperlink r:id="rId209">
         <w:r>
           <w:rPr>
             <w:rStyle w:val="Hyperlink"/>
@@ -27525,8 +27584,8 @@
         <w:t xml:space="preserve">.</w:t>
       </w:r>
     </w:p>
-    <w:bookmarkEnd w:id="209"/>
-    <w:bookmarkStart w:id="211" w:name="ref-anthropics_claude_agent_sdk_python"/>
+    <w:bookmarkEnd w:id="210"/>
+    <w:bookmarkStart w:id="212" w:name="ref-anthropics_claude_agent_sdk_python"/>
     <w:p>
       <w:pPr>
         <w:pStyle w:val="Bibliography"/>
@@ -27550,7 +27609,7 @@
       <w:r>
         <w:t xml:space="preserve"> </w:t>
       </w:r>
-      <w:hyperlink r:id="rId210">
+      <w:hyperlink r:id="rId211">
         <w:r>
           <w:rPr>
             <w:rStyle w:val="Hyperlink"/>
@@ -27562,8 +27621,8 @@
         <w:t xml:space="preserve">.</w:t>
       </w:r>
     </w:p>
-    <w:bookmarkEnd w:id="211"/>
-    <w:bookmarkStart w:id="213" w:name="Xe244a55519dd264b789be278af49274a06232cb"/>
+    <w:bookmarkEnd w:id="212"/>
+    <w:bookmarkStart w:id="214" w:name="Xe244a55519dd264b789be278af49274a06232cb"/>
     <w:p>
       <w:pPr>
         <w:pStyle w:val="Bibliography"/>
@@ -27587,7 +27646,7 @@
       <w:r>
         <w:t xml:space="preserve"> </w:t>
       </w:r>
-      <w:hyperlink r:id="rId212">
+      <w:hyperlink r:id="rId213">
         <w:r>
           <w:rPr>
             <w:rStyle w:val="Hyperlink"/>
@@ -27599,8 +27658,8 @@
         <w:t xml:space="preserve">.</w:t>
       </w:r>
     </w:p>
-    <w:bookmarkEnd w:id="213"/>
-    <w:bookmarkStart w:id="215" w:name="ref-anthropics_claude_code_repo"/>
+    <w:bookmarkEnd w:id="214"/>
+    <w:bookmarkStart w:id="216" w:name="ref-anthropics_claude_code_repo"/>
     <w:p>
       <w:pPr>
         <w:pStyle w:val="Bibliography"/>
@@ -27624,7 +27683,7 @@
       <w:r>
         <w:t xml:space="preserve"> </w:t>
       </w:r>
-      <w:hyperlink r:id="rId214">
+      <w:hyperlink r:id="rId215">
         <w:r>
           <w:rPr>
             <w:rStyle w:val="Hyperlink"/>
@@ -27636,8 +27695,8 @@
         <w:t xml:space="preserve">.</w:t>
       </w:r>
     </w:p>
-    <w:bookmarkEnd w:id="215"/>
-    <w:bookmarkStart w:id="217" w:name="ref-anthropics_claude_code_changelog"/>
+    <w:bookmarkEnd w:id="216"/>
+    <w:bookmarkStart w:id="218" w:name="ref-anthropics_claude_code_changelog"/>
     <w:p>
       <w:pPr>
         <w:pStyle w:val="Bibliography"/>
@@ -27661,7 +27720,7 @@
       <w:r>
         <w:t xml:space="preserve"> </w:t>
       </w:r>
-      <w:hyperlink r:id="rId216">
+      <w:hyperlink r:id="rId217">
         <w:r>
           <w:rPr>
             <w:rStyle w:val="Hyperlink"/>
@@ -27673,8 +27732,8 @@
         <w:t xml:space="preserve">.</w:t>
       </w:r>
     </w:p>
-    <w:bookmarkEnd w:id="217"/>
-    <w:bookmarkStart w:id="219" w:name="ref-anthropics_claude_code_action_repo"/>
+    <w:bookmarkEnd w:id="218"/>
+    <w:bookmarkStart w:id="220" w:name="ref-anthropics_claude_code_action_repo"/>
     <w:p>
       <w:pPr>
         <w:pStyle w:val="Bibliography"/>
@@ -27698,7 +27757,7 @@
       <w:r>
         <w:t xml:space="preserve"> </w:t>
       </w:r>
-      <w:hyperlink r:id="rId218">
+      <w:hyperlink r:id="rId219">
         <w:r>
           <w:rPr>
             <w:rStyle w:val="Hyperlink"/>
@@ -27710,8 +27769,8 @@
         <w:t xml:space="preserve">.</w:t>
       </w:r>
     </w:p>
-    <w:bookmarkEnd w:id="219"/>
-    <w:bookmarkStart w:id="221" w:name="Xd088ae97f0dcb18c0f270498b2b534fb7f67709"/>
+    <w:bookmarkEnd w:id="220"/>
+    <w:bookmarkStart w:id="222" w:name="Xd088ae97f0dcb18c0f270498b2b534fb7f67709"/>
     <w:p>
       <w:pPr>
         <w:pStyle w:val="Bibliography"/>
@@ -27735,7 +27794,7 @@
       <w:r>
         <w:t xml:space="preserve"> </w:t>
       </w:r>
-      <w:hyperlink r:id="rId220">
+      <w:hyperlink r:id="rId221">
         <w:r>
           <w:rPr>
             <w:rStyle w:val="Hyperlink"/>
@@ -27747,8 +27806,8 @@
         <w:t xml:space="preserve">.</w:t>
       </w:r>
     </w:p>
-    <w:bookmarkEnd w:id="221"/>
-    <w:bookmarkStart w:id="223" w:name="ref-anthropics_claude_plugins_community"/>
+    <w:bookmarkEnd w:id="222"/>
+    <w:bookmarkStart w:id="224" w:name="ref-anthropics_claude_plugins_community"/>
     <w:p>
       <w:pPr>
         <w:pStyle w:val="Bibliography"/>
@@ -27772,7 +27831,7 @@
       <w:r>
         <w:t xml:space="preserve"> </w:t>
       </w:r>
-      <w:hyperlink r:id="rId222">
+      <w:hyperlink r:id="rId223">
         <w:r>
           <w:rPr>
             <w:rStyle w:val="Hyperlink"/>
@@ -27784,8 +27843,8 @@
         <w:t xml:space="preserve">.</w:t>
       </w:r>
     </w:p>
-    <w:bookmarkEnd w:id="223"/>
-    <w:bookmarkStart w:id="225" w:name="ref-anthropics_claude_plugins_official"/>
+    <w:bookmarkEnd w:id="224"/>
+    <w:bookmarkStart w:id="226" w:name="ref-anthropics_claude_plugins_official"/>
     <w:p>
       <w:pPr>
         <w:pStyle w:val="Bibliography"/>
@@ -27809,7 +27868,7 @@
       <w:r>
         <w:t xml:space="preserve"> </w:t>
       </w:r>
-      <w:hyperlink r:id="rId224">
+      <w:hyperlink r:id="rId225">
         <w:r>
           <w:rPr>
             <w:rStyle w:val="Hyperlink"/>
@@ -27821,8 +27880,8 @@
         <w:t xml:space="preserve">.</w:t>
       </w:r>
     </w:p>
-    <w:bookmarkEnd w:id="225"/>
-    <w:bookmarkStart w:id="227" w:name="ref-anthropics_knowledge_work_plugins"/>
+    <w:bookmarkEnd w:id="226"/>
+    <w:bookmarkStart w:id="228" w:name="ref-anthropics_knowledge_work_plugins"/>
     <w:p>
       <w:pPr>
         <w:pStyle w:val="Bibliography"/>
@@ -27846,7 +27905,7 @@
       <w:r>
         <w:t xml:space="preserve"> </w:t>
       </w:r>
-      <w:hyperlink r:id="rId226">
+      <w:hyperlink r:id="rId227">
         <w:r>
           <w:rPr>
             <w:rStyle w:val="Hyperlink"/>
@@ -27858,8 +27917,8 @@
         <w:t xml:space="preserve">.</w:t>
       </w:r>
     </w:p>
-    <w:bookmarkEnd w:id="227"/>
-    <w:bookmarkStart w:id="229" w:name="ref-anthropics_sandbox_runtime"/>
+    <w:bookmarkEnd w:id="228"/>
+    <w:bookmarkStart w:id="230" w:name="ref-anthropics_sandbox_runtime"/>
     <w:p>
       <w:pPr>
         <w:pStyle w:val="Bibliography"/>
@@ -27883,7 +27942,7 @@
       <w:r>
         <w:t xml:space="preserve"> </w:t>
       </w:r>
-      <w:hyperlink r:id="rId228">
+      <w:hyperlink r:id="rId229">
         <w:r>
           <w:rPr>
             <w:rStyle w:val="Hyperlink"/>
@@ -27895,8 +27954,8 @@
         <w:t xml:space="preserve">.</w:t>
       </w:r>
     </w:p>
-    <w:bookmarkEnd w:id="229"/>
-    <w:bookmarkStart w:id="231" w:name="ref-anthropics_skills_repo"/>
+    <w:bookmarkEnd w:id="230"/>
+    <w:bookmarkStart w:id="232" w:name="ref-anthropics_skills_repo"/>
     <w:p>
       <w:pPr>
         <w:pStyle w:val="Bibliography"/>
@@ -27920,7 +27979,7 @@
       <w:r>
         <w:t xml:space="preserve"> </w:t>
       </w:r>
-      <w:hyperlink r:id="rId230">
+      <w:hyperlink r:id="rId231">
         <w:r>
           <w:rPr>
             <w:rStyle w:val="Hyperlink"/>
@@ -27932,8 +27991,8 @@
         <w:t xml:space="preserve">.</w:t>
       </w:r>
     </w:p>
-    <w:bookmarkEnd w:id="231"/>
-    <w:bookmarkStart w:id="232" w:name="ref-claude_code_changelog"/>
+    <w:bookmarkEnd w:id="232"/>
+    <w:bookmarkStart w:id="233" w:name="ref-claude_code_changelog"/>
     <w:p>
       <w:pPr>
         <w:pStyle w:val="Bibliography"/>
@@ -27957,7 +28016,7 @@
       <w:r>
         <w:t xml:space="preserve"> </w:t>
       </w:r>
-      <w:hyperlink r:id="rId216">
+      <w:hyperlink r:id="rId217">
         <w:r>
           <w:rPr>
             <w:rStyle w:val="Hyperlink"/>
@@ -27969,8 +28028,8 @@
         <w:t xml:space="preserve">.</w:t>
       </w:r>
     </w:p>
-    <w:bookmarkEnd w:id="232"/>
-    <w:bookmarkStart w:id="234" w:name="Xea89bf890c1435f10c5e1afa0952be3a48628f8"/>
+    <w:bookmarkEnd w:id="233"/>
+    <w:bookmarkStart w:id="235" w:name="Xea89bf890c1435f10c5e1afa0952be3a48628f8"/>
     <w:p>
       <w:pPr>
         <w:pStyle w:val="Bibliography"/>
@@ -27994,7 +28053,7 @@
       <w:r>
         <w:t xml:space="preserve"> </w:t>
       </w:r>
-      <w:hyperlink r:id="rId233">
+      <w:hyperlink r:id="rId234">
         <w:r>
           <w:rPr>
             <w:rStyle w:val="Hyperlink"/>
@@ -28006,8 +28065,8 @@
         <w:t xml:space="preserve">.</w:t>
       </w:r>
     </w:p>
-    <w:bookmarkEnd w:id="234"/>
-    <w:bookmarkStart w:id="236" w:name="ref-claude_code_permissions"/>
+    <w:bookmarkEnd w:id="235"/>
+    <w:bookmarkStart w:id="237" w:name="ref-claude_code_permissions"/>
     <w:p>
       <w:pPr>
         <w:pStyle w:val="Bibliography"/>
@@ -28031,7 +28090,7 @@
       <w:r>
         <w:t xml:space="preserve"> </w:t>
       </w:r>
-      <w:hyperlink r:id="rId235">
+      <w:hyperlink r:id="rId236">
         <w:r>
           <w:rPr>
             <w:rStyle w:val="Hyperlink"/>
@@ -28043,8 +28102,8 @@
         <w:t xml:space="preserve">.</w:t>
       </w:r>
     </w:p>
-    <w:bookmarkEnd w:id="236"/>
-    <w:bookmarkStart w:id="238" w:name="ref-claude_code_subagents"/>
+    <w:bookmarkEnd w:id="237"/>
+    <w:bookmarkStart w:id="239" w:name="ref-claude_code_subagents"/>
     <w:p>
       <w:pPr>
         <w:pStyle w:val="Bibliography"/>
@@ -28068,7 +28127,7 @@
       <w:r>
         <w:t xml:space="preserve"> </w:t>
       </w:r>
-      <w:hyperlink r:id="rId237">
+      <w:hyperlink r:id="rId238">
         <w:r>
           <w:rPr>
             <w:rStyle w:val="Hyperlink"/>
@@ -28080,8 +28139,8 @@
         <w:t xml:space="preserve">.</w:t>
       </w:r>
     </w:p>
-    <w:bookmarkEnd w:id="238"/>
-    <w:bookmarkStart w:id="240" w:name="ref-claude_code_plugins"/>
+    <w:bookmarkEnd w:id="239"/>
+    <w:bookmarkStart w:id="241" w:name="ref-claude_code_plugins"/>
     <w:p>
       <w:pPr>
         <w:pStyle w:val="Bibliography"/>
@@ -28105,7 +28164,7 @@
       <w:r>
         <w:t xml:space="preserve"> </w:t>
       </w:r>
-      <w:hyperlink r:id="rId239">
+      <w:hyperlink r:id="rId240">
         <w:r>
           <w:rPr>
             <w:rStyle w:val="Hyperlink"/>
@@ -28117,8 +28176,8 @@
         <w:t xml:space="preserve">.</w:t>
       </w:r>
     </w:p>
-    <w:bookmarkEnd w:id="240"/>
-    <w:bookmarkStart w:id="242" w:name="ref-claude_code_env_vars"/>
+    <w:bookmarkEnd w:id="241"/>
+    <w:bookmarkStart w:id="243" w:name="ref-claude_code_env_vars"/>
     <w:p>
       <w:pPr>
         <w:pStyle w:val="Bibliography"/>
@@ -28142,7 +28201,7 @@
       <w:r>
         <w:t xml:space="preserve"> </w:t>
       </w:r>
-      <w:hyperlink r:id="rId241">
+      <w:hyperlink r:id="rId242">
         <w:r>
           <w:rPr>
             <w:rStyle w:val="Hyperlink"/>
@@ -28154,8 +28213,8 @@
         <w:t xml:space="preserve">.</w:t>
       </w:r>
     </w:p>
-    <w:bookmarkEnd w:id="242"/>
-    <w:bookmarkStart w:id="244" w:name="Xf04ee902643acca60cff84dc2fcb508ef114f4e"/>
+    <w:bookmarkEnd w:id="243"/>
+    <w:bookmarkStart w:id="245" w:name="Xf04ee902643acca60cff84dc2fcb508ef114f4e"/>
     <w:p>
       <w:pPr>
         <w:pStyle w:val="Bibliography"/>
@@ -28179,7 +28238,7 @@
       <w:r>
         <w:t xml:space="preserve"> </w:t>
       </w:r>
-      <w:hyperlink r:id="rId243">
+      <w:hyperlink r:id="rId244">
         <w:r>
           <w:rPr>
             <w:rStyle w:val="Hyperlink"/>
@@ -28191,8 +28250,8 @@
         <w:t xml:space="preserve">.</w:t>
       </w:r>
     </w:p>
-    <w:bookmarkEnd w:id="244"/>
-    <w:bookmarkStart w:id="246" w:name="ref-claude_code_context_window"/>
+    <w:bookmarkEnd w:id="245"/>
+    <w:bookmarkStart w:id="247" w:name="ref-claude_code_context_window"/>
     <w:p>
       <w:pPr>
         <w:pStyle w:val="Bibliography"/>
@@ -28216,7 +28275,7 @@
       <w:r>
         <w:t xml:space="preserve"> </w:t>
       </w:r>
-      <w:hyperlink r:id="rId245">
+      <w:hyperlink r:id="rId246">
         <w:r>
           <w:rPr>
             <w:rStyle w:val="Hyperlink"/>
@@ -28228,8 +28287,8 @@
         <w:t xml:space="preserve">.</w:t>
       </w:r>
     </w:p>
-    <w:bookmarkEnd w:id="246"/>
-    <w:bookmarkStart w:id="248" w:name="ref-claude_code_hooks_reference"/>
+    <w:bookmarkEnd w:id="247"/>
+    <w:bookmarkStart w:id="249" w:name="ref-claude_code_hooks_reference"/>
     <w:p>
       <w:pPr>
         <w:pStyle w:val="Bibliography"/>
@@ -28253,7 +28312,7 @@
       <w:r>
         <w:t xml:space="preserve"> </w:t>
       </w:r>
-      <w:hyperlink r:id="rId247">
+      <w:hyperlink r:id="rId248">
         <w:r>
           <w:rPr>
             <w:rStyle w:val="Hyperlink"/>
@@ -28265,8 +28324,8 @@
         <w:t xml:space="preserve">.</w:t>
       </w:r>
     </w:p>
-    <w:bookmarkEnd w:id="248"/>
-    <w:bookmarkStart w:id="250" w:name="ref-claude_code_how_it_works"/>
+    <w:bookmarkEnd w:id="249"/>
+    <w:bookmarkStart w:id="251" w:name="ref-claude_code_how_it_works"/>
     <w:p>
       <w:pPr>
         <w:pStyle w:val="Bibliography"/>
@@ -28290,7 +28349,7 @@
       <w:r>
         <w:t xml:space="preserve"> </w:t>
       </w:r>
-      <w:hyperlink r:id="rId249">
+      <w:hyperlink r:id="rId250">
         <w:r>
           <w:rPr>
             <w:rStyle w:val="Hyperlink"/>
@@ -28302,8 +28361,8 @@
         <w:t xml:space="preserve">.</w:t>
       </w:r>
     </w:p>
-    <w:bookmarkEnd w:id="250"/>
-    <w:bookmarkStart w:id="252" w:name="ref-claude_code_memory"/>
+    <w:bookmarkEnd w:id="251"/>
+    <w:bookmarkStart w:id="253" w:name="ref-claude_code_memory"/>
     <w:p>
       <w:pPr>
         <w:pStyle w:val="Bibliography"/>
@@ -28327,7 +28386,7 @@
       <w:r>
         <w:t xml:space="preserve"> </w:t>
       </w:r>
-      <w:hyperlink r:id="rId251">
+      <w:hyperlink r:id="rId252">
         <w:r>
           <w:rPr>
             <w:rStyle w:val="Hyperlink"/>
@@ -28339,8 +28398,8 @@
         <w:t xml:space="preserve">.</w:t>
       </w:r>
     </w:p>
-    <w:bookmarkEnd w:id="252"/>
-    <w:bookmarkStart w:id="254" w:name="ref-claude_code_tools_reference"/>
+    <w:bookmarkEnd w:id="253"/>
+    <w:bookmarkStart w:id="255" w:name="ref-claude_code_tools_reference"/>
     <w:p>
       <w:pPr>
         <w:pStyle w:val="Bibliography"/>
@@ -28364,7 +28423,7 @@
       <w:r>
         <w:t xml:space="preserve"> </w:t>
       </w:r>
-      <w:hyperlink r:id="rId253">
+      <w:hyperlink r:id="rId254">
         <w:r>
           <w:rPr>
             <w:rStyle w:val="Hyperlink"/>
@@ -28376,8 +28435,8 @@
         <w:t xml:space="preserve">.</w:t>
       </w:r>
     </w:p>
-    <w:bookmarkEnd w:id="254"/>
-    <w:bookmarkStart w:id="256" w:name="ref-claude_code_issue_62061"/>
+    <w:bookmarkEnd w:id="255"/>
+    <w:bookmarkStart w:id="257" w:name="ref-claude_code_issue_62061"/>
     <w:p>
       <w:pPr>
         <w:pStyle w:val="Bibliography"/>
@@ -28404,7 +28463,7 @@
       <w:r>
         <w:t xml:space="preserve"> </w:t>
       </w:r>
-      <w:hyperlink r:id="rId255">
+      <w:hyperlink r:id="rId256">
         <w:r>
           <w:rPr>
             <w:rStyle w:val="Hyperlink"/>
@@ -28416,8 +28475,8 @@
         <w:t xml:space="preserve">.</w:t>
       </w:r>
     </w:p>
-    <w:bookmarkEnd w:id="256"/>
-    <w:bookmarkStart w:id="258" w:name="ref-claude_code_issue_80988"/>
+    <w:bookmarkEnd w:id="257"/>
+    <w:bookmarkStart w:id="259" w:name="ref-claude_code_issue_80988"/>
     <w:p>
       <w:pPr>
         <w:pStyle w:val="Bibliography"/>
@@ -28472,7 +28531,7 @@
       <w:r>
         <w:t xml:space="preserve"> </w:t>
       </w:r>
-      <w:hyperlink r:id="rId257">
+      <w:hyperlink r:id="rId258">
         <w:r>
           <w:rPr>
             <w:rStyle w:val="Hyperlink"/>
@@ -28484,8 +28543,8 @@
         <w:t xml:space="preserve">.</w:t>
       </w:r>
     </w:p>
-    <w:bookmarkEnd w:id="258"/>
-    <w:bookmarkStart w:id="260" w:name="ref-claude_code_issue_80998"/>
+    <w:bookmarkEnd w:id="259"/>
+    <w:bookmarkStart w:id="261" w:name="ref-claude_code_issue_80998"/>
     <w:p>
       <w:pPr>
         <w:pStyle w:val="Bibliography"/>
@@ -28512,7 +28571,7 @@
       <w:r>
         <w:t xml:space="preserve"> </w:t>
       </w:r>
-      <w:hyperlink r:id="rId259">
+      <w:hyperlink r:id="rId260">
         <w:r>
           <w:rPr>
             <w:rStyle w:val="Hyperlink"/>
@@ -28524,8 +28583,8 @@
         <w:t xml:space="preserve">.</w:t>
       </w:r>
     </w:p>
-    <w:bookmarkEnd w:id="260"/>
-    <w:bookmarkStart w:id="262" w:name="ref-claude_code_issue_87635"/>
+    <w:bookmarkEnd w:id="261"/>
+    <w:bookmarkStart w:id="263" w:name="ref-claude_code_issue_87635"/>
     <w:p>
       <w:pPr>
         <w:pStyle w:val="Bibliography"/>
@@ -28552,7 +28611,7 @@
       <w:r>
         <w:t xml:space="preserve"> </w:t>
       </w:r>
-      <w:hyperlink r:id="rId261">
+      <w:hyperlink r:id="rId262">
         <w:r>
           <w:rPr>
             <w:rStyle w:val="Hyperlink"/>
@@ -28564,8 +28623,8 @@
         <w:t xml:space="preserve">.</w:t>
       </w:r>
     </w:p>
-    <w:bookmarkEnd w:id="262"/>
-    <w:bookmarkStart w:id="264" w:name="ref-claude_code_issue_82456"/>
+    <w:bookmarkEnd w:id="263"/>
+    <w:bookmarkStart w:id="265" w:name="ref-claude_code_issue_82456"/>
     <w:p>
       <w:pPr>
         <w:pStyle w:val="Bibliography"/>
@@ -28620,7 +28679,7 @@
       <w:r>
         <w:t xml:space="preserve"> </w:t>
       </w:r>
-      <w:hyperlink r:id="rId263">
+      <w:hyperlink r:id="rId264">
         <w:r>
           <w:rPr>
             <w:rStyle w:val="Hyperlink"/>
@@ -28632,8 +28691,8 @@
         <w:t xml:space="preserve">.</w:t>
       </w:r>
     </w:p>
-    <w:bookmarkEnd w:id="264"/>
-    <w:bookmarkStart w:id="266" w:name="ref-cache_fix_heron_brook_disclosure"/>
+    <w:bookmarkEnd w:id="265"/>
+    <w:bookmarkStart w:id="267" w:name="ref-cache_fix_heron_brook_disclosure"/>
     <w:p>
       <w:pPr>
         <w:pStyle w:val="Bibliography"/>
@@ -28660,7 +28719,7 @@
       <w:r>
         <w:t xml:space="preserve"> </w:t>
       </w:r>
-      <w:hyperlink r:id="rId265">
+      <w:hyperlink r:id="rId266">
         <w:r>
           <w:rPr>
             <w:rStyle w:val="Hyperlink"/>
@@ -28672,8 +28731,8 @@
         <w:t xml:space="preserve">.</w:t>
       </w:r>
     </w:p>
-    <w:bookmarkEnd w:id="266"/>
-    <w:bookmarkStart w:id="267" w:name="ref-my_claude_code_harness"/>
+    <w:bookmarkEnd w:id="267"/>
+    <w:bookmarkStart w:id="268" w:name="ref-my_claude_code_harness"/>
     <w:p>
       <w:pPr>
         <w:pStyle w:val="Bibliography"/>
@@ -28712,8 +28771,8 @@
         <w:t xml:space="preserve">.</w:t>
       </w:r>
     </w:p>
-    <w:bookmarkEnd w:id="267"/>
-    <w:bookmarkStart w:id="268" w:name="ref-opencode_daytona"/>
+    <w:bookmarkEnd w:id="268"/>
+    <w:bookmarkStart w:id="269" w:name="ref-opencode_daytona"/>
     <w:p>
       <w:pPr>
         <w:pStyle w:val="Bibliography"/>
@@ -28749,8 +28808,8 @@
         <w:t xml:space="preserve">.</w:t>
       </w:r>
     </w:p>
-    <w:bookmarkEnd w:id="268"/>
-    <w:bookmarkStart w:id="269" w:name="ref-openwork"/>
+    <w:bookmarkEnd w:id="269"/>
+    <w:bookmarkStart w:id="270" w:name="ref-openwork"/>
     <w:p>
       <w:pPr>
         <w:pStyle w:val="Bibliography"/>
@@ -28777,7 +28836,7 @@
       <w:r>
         <w:t xml:space="preserve"> </w:t>
       </w:r>
-      <w:hyperlink r:id="rId166">
+      <w:hyperlink r:id="rId167">
         <w:r>
           <w:rPr>
             <w:rStyle w:val="Hyperlink"/>
@@ -28789,8 +28848,8 @@
         <w:t xml:space="preserve">.</w:t>
       </w:r>
     </w:p>
-    <w:bookmarkEnd w:id="269"/>
-    <w:bookmarkStart w:id="270" w:name="ref-opencode_nvim"/>
+    <w:bookmarkEnd w:id="270"/>
+    <w:bookmarkStart w:id="271" w:name="ref-opencode_nvim"/>
     <w:p>
       <w:pPr>
         <w:pStyle w:val="Bibliography"/>
@@ -28814,7 +28873,7 @@
       <w:r>
         <w:t xml:space="preserve"> </w:t>
       </w:r>
-      <w:hyperlink r:id="rId168">
+      <w:hyperlink r:id="rId169">
         <w:r>
           <w:rPr>
             <w:rStyle w:val="Hyperlink"/>
@@ -28826,8 +28885,8 @@
         <w:t xml:space="preserve">.</w:t>
       </w:r>
     </w:p>
-    <w:bookmarkEnd w:id="270"/>
-    <w:bookmarkStart w:id="271" w:name="ref-opencode_antigravity_auth"/>
+    <w:bookmarkEnd w:id="271"/>
+    <w:bookmarkStart w:id="272" w:name="ref-opencode_antigravity_auth"/>
     <w:p>
       <w:pPr>
         <w:pStyle w:val="Bibliography"/>
@@ -28863,8 +28922,8 @@
         <w:t xml:space="preserve">.</w:t>
       </w:r>
     </w:p>
-    <w:bookmarkEnd w:id="271"/>
-    <w:bookmarkStart w:id="272" w:name="ref-oh_my_claudecode"/>
+    <w:bookmarkEnd w:id="272"/>
+    <w:bookmarkStart w:id="273" w:name="ref-oh_my_claudecode"/>
     <w:p>
       <w:pPr>
         <w:pStyle w:val="Bibliography"/>
@@ -28900,8 +28959,8 @@
         <w:t xml:space="preserve">.</w:t>
       </w:r>
     </w:p>
-    <w:bookmarkEnd w:id="272"/>
-    <w:bookmarkStart w:id="273" w:name="ref-openharness"/>
+    <w:bookmarkEnd w:id="273"/>
+    <w:bookmarkStart w:id="274" w:name="ref-openharness"/>
     <w:p>
       <w:pPr>
         <w:pStyle w:val="Bibliography"/>
@@ -28937,8 +28996,8 @@
         <w:t xml:space="preserve">.</w:t>
       </w:r>
     </w:p>
-    <w:bookmarkEnd w:id="273"/>
-    <w:bookmarkStart w:id="274" w:name="ref-opencode_portal"/>
+    <w:bookmarkEnd w:id="274"/>
+    <w:bookmarkStart w:id="275" w:name="ref-opencode_portal"/>
     <w:p>
       <w:pPr>
         <w:pStyle w:val="Bibliography"/>
@@ -28965,7 +29024,7 @@
       <w:r>
         <w:t xml:space="preserve"> </w:t>
       </w:r>
-      <w:hyperlink r:id="rId171">
+      <w:hyperlink r:id="rId172">
         <w:r>
           <w:rPr>
             <w:rStyle w:val="Hyperlink"/>
@@ -28977,8 +29036,8 @@
         <w:t xml:space="preserve">.</w:t>
       </w:r>
     </w:p>
-    <w:bookmarkEnd w:id="274"/>
-    <w:bookmarkStart w:id="275" w:name="ref-opencode_vibeguard"/>
+    <w:bookmarkEnd w:id="275"/>
+    <w:bookmarkStart w:id="276" w:name="ref-opencode_vibeguard"/>
     <w:p>
       <w:pPr>
         <w:pStyle w:val="Bibliography"/>
@@ -29017,8 +29076,8 @@
         <w:t xml:space="preserve">.</w:t>
       </w:r>
     </w:p>
-    <w:bookmarkEnd w:id="275"/>
-    <w:bookmarkStart w:id="276" w:name="ref-ocx"/>
+    <w:bookmarkEnd w:id="276"/>
+    <w:bookmarkStart w:id="277" w:name="ref-ocx"/>
     <w:p>
       <w:pPr>
         <w:pStyle w:val="Bibliography"/>
@@ -29045,7 +29104,7 @@
       <w:r>
         <w:t xml:space="preserve"> </w:t>
       </w:r>
-      <w:hyperlink r:id="rId173">
+      <w:hyperlink r:id="rId174">
         <w:r>
           <w:rPr>
             <w:rStyle w:val="Hyperlink"/>
@@ -29057,8 +29116,8 @@
         <w:t xml:space="preserve">.</w:t>
       </w:r>
     </w:p>
-    <w:bookmarkEnd w:id="276"/>
-    <w:bookmarkStart w:id="277" w:name="ref-opencode_background_agents"/>
+    <w:bookmarkEnd w:id="277"/>
+    <w:bookmarkStart w:id="278" w:name="ref-opencode_background_agents"/>
     <w:p>
       <w:pPr>
         <w:pStyle w:val="Bibliography"/>
@@ -29097,8 +29156,8 @@
         <w:t xml:space="preserve">.</w:t>
       </w:r>
     </w:p>
-    <w:bookmarkEnd w:id="277"/>
-    <w:bookmarkStart w:id="278" w:name="ref-opencode_workspace"/>
+    <w:bookmarkEnd w:id="278"/>
+    <w:bookmarkStart w:id="279" w:name="ref-opencode_workspace"/>
     <w:p>
       <w:pPr>
         <w:pStyle w:val="Bibliography"/>
@@ -29137,8 +29196,8 @@
         <w:t xml:space="preserve">.</w:t>
       </w:r>
     </w:p>
-    <w:bookmarkEnd w:id="278"/>
-    <w:bookmarkStart w:id="279" w:name="ref-opencode_worktree"/>
+    <w:bookmarkEnd w:id="279"/>
+    <w:bookmarkStart w:id="280" w:name="ref-opencode_worktree"/>
     <w:p>
       <w:pPr>
         <w:pStyle w:val="Bibliography"/>
@@ -29177,8 +29236,8 @@
         <w:t xml:space="preserve">.</w:t>
       </w:r>
     </w:p>
-    <w:bookmarkEnd w:id="279"/>
-    <w:bookmarkStart w:id="281" w:name="ref-hn_claude_code_remote_prompts"/>
+    <w:bookmarkEnd w:id="280"/>
+    <w:bookmarkStart w:id="282" w:name="ref-hn_claude_code_remote_prompts"/>
     <w:p>
       <w:pPr>
         <w:pStyle w:val="Bibliography"/>
@@ -29205,7 +29264,7 @@
       <w:r>
         <w:t xml:space="preserve"> </w:t>
       </w:r>
-      <w:hyperlink r:id="rId280">
+      <w:hyperlink r:id="rId281">
         <w:r>
           <w:rPr>
             <w:rStyle w:val="Hyperlink"/>
@@ -29217,8 +29276,8 @@
         <w:t xml:space="preserve">.</w:t>
       </w:r>
     </w:p>
-    <w:bookmarkEnd w:id="281"/>
-    <w:bookmarkStart w:id="282" w:name="ref-codenomad"/>
+    <w:bookmarkEnd w:id="282"/>
+    <w:bookmarkStart w:id="283" w:name="ref-codenomad"/>
     <w:p>
       <w:pPr>
         <w:pStyle w:val="Bibliography"/>
@@ -29254,8 +29313,8 @@
         <w:t xml:space="preserve">.</w:t>
       </w:r>
     </w:p>
-    <w:bookmarkEnd w:id="282"/>
-    <w:bookmarkStart w:id="283" w:name="ref-openchamber"/>
+    <w:bookmarkEnd w:id="283"/>
+    <w:bookmarkStart w:id="284" w:name="ref-openchamber"/>
     <w:p>
       <w:pPr>
         <w:pStyle w:val="Bibliography"/>
@@ -29271,10 +29330,10 @@
           <w:i/>
           <w:iCs/>
         </w:rPr>
-        <w:t xml:space="preserve">OpenChamber: Agentic Development Environment for OpenCode</w:t>
-      </w:r>
-      <w:r>
-        <w:t xml:space="preserve">. GitHub repository.</w:t>
+        <w:t xml:space="preserve">OpenChamber: Agentic Development Environment for AI Coding</w:t>
+      </w:r>
+      <w:r>
+        <w:t xml:space="preserve">. Web site and GitHub repository.</w:t>
       </w:r>
       <w:r>
         <w:t xml:space="preserve"> </w:t>
@@ -29284,15 +29343,15 @@
           <w:rPr>
             <w:rStyle w:val="Hyperlink"/>
           </w:rPr>
-          <w:t xml:space="preserve">https://github.com/openchamber/openchamber</w:t>
+          <w:t xml:space="preserve">https://openchamber.dev/</w:t>
         </w:r>
       </w:hyperlink>
       <w:r>
         <w:t xml:space="preserve">.</w:t>
       </w:r>
     </w:p>
-    <w:bookmarkEnd w:id="283"/>
-    <w:bookmarkStart w:id="285" w:name="ref-opencode_ecosystem"/>
+    <w:bookmarkEnd w:id="284"/>
+    <w:bookmarkStart w:id="286" w:name="ref-opencode_ecosystem"/>
     <w:p>
       <w:pPr>
         <w:pStyle w:val="Bibliography"/>
@@ -29316,7 +29375,7 @@
       <w:r>
         <w:t xml:space="preserve"> </w:t>
       </w:r>
-      <w:hyperlink r:id="rId284">
+      <w:hyperlink r:id="rId285">
         <w:r>
           <w:rPr>
             <w:rStyle w:val="Hyperlink"/>
@@ -29328,8 +29387,8 @@
         <w:t xml:space="preserve">.</w:t>
       </w:r>
     </w:p>
-    <w:bookmarkEnd w:id="285"/>
-    <w:bookmarkStart w:id="287" w:name="ref-opencode_go"/>
+    <w:bookmarkEnd w:id="286"/>
+    <w:bookmarkStart w:id="288" w:name="ref-opencode_go"/>
     <w:p>
       <w:pPr>
         <w:pStyle w:val="Bibliography"/>
@@ -29353,7 +29412,7 @@
       <w:r>
         <w:t xml:space="preserve"> </w:t>
       </w:r>
-      <w:hyperlink r:id="rId286">
+      <w:hyperlink r:id="rId287">
         <w:r>
           <w:rPr>
             <w:rStyle w:val="Hyperlink"/>
@@ -29365,8 +29424,8 @@
         <w:t xml:space="preserve">.</w:t>
       </w:r>
     </w:p>
-    <w:bookmarkEnd w:id="287"/>
-    <w:bookmarkStart w:id="289" w:name="ref-opencode_plugins"/>
+    <w:bookmarkEnd w:id="288"/>
+    <w:bookmarkStart w:id="290" w:name="ref-opencode_plugins"/>
     <w:p>
       <w:pPr>
         <w:pStyle w:val="Bibliography"/>
@@ -29390,7 +29449,7 @@
       <w:r>
         <w:t xml:space="preserve"> </w:t>
       </w:r>
-      <w:hyperlink r:id="rId288">
+      <w:hyperlink r:id="rId289">
         <w:r>
           <w:rPr>
             <w:rStyle w:val="Hyperlink"/>
@@ -29402,8 +29461,8 @@
         <w:t xml:space="preserve">.</w:t>
       </w:r>
     </w:p>
-    <w:bookmarkEnd w:id="289"/>
-    <w:bookmarkStart w:id="291" w:name="ref-opencode_zen"/>
+    <w:bookmarkEnd w:id="290"/>
+    <w:bookmarkStart w:id="292" w:name="ref-opencode_zen"/>
     <w:p>
       <w:pPr>
         <w:pStyle w:val="Bibliography"/>
@@ -29427,7 +29486,7 @@
       <w:r>
         <w:t xml:space="preserve"> </w:t>
       </w:r>
-      <w:hyperlink r:id="rId290">
+      <w:hyperlink r:id="rId291">
         <w:r>
           <w:rPr>
             <w:rStyle w:val="Hyperlink"/>
@@ -29439,8 +29498,8 @@
         <w:t xml:space="preserve">.</w:t>
       </w:r>
     </w:p>
-    <w:bookmarkEnd w:id="291"/>
-    <w:bookmarkStart w:id="292" w:name="ref-opencode_dcp"/>
+    <w:bookmarkEnd w:id="292"/>
+    <w:bookmarkStart w:id="293" w:name="ref-opencode_dcp"/>
     <w:p>
       <w:pPr>
         <w:pStyle w:val="Bibliography"/>
@@ -29476,8 +29535,8 @@
         <w:t xml:space="preserve">.</w:t>
       </w:r>
     </w:p>
-    <w:bookmarkEnd w:id="292"/>
-    <w:bookmarkStart w:id="293" w:name="ref-gsd_core"/>
+    <w:bookmarkEnd w:id="293"/>
+    <w:bookmarkStart w:id="294" w:name="ref-gsd_core"/>
     <w:p>
       <w:pPr>
         <w:pStyle w:val="Bibliography"/>
@@ -29516,8 +29575,8 @@
         <w:t xml:space="preserve">.</w:t>
       </w:r>
     </w:p>
-    <w:bookmarkEnd w:id="293"/>
-    <w:bookmarkStart w:id="295" w:name="X6a5f703df06c18671fb83906214e2236890a9cd"/>
+    <w:bookmarkEnd w:id="294"/>
+    <w:bookmarkStart w:id="296" w:name="X6a5f703df06c18671fb83906214e2236890a9cd"/>
     <w:p>
       <w:pPr>
         <w:pStyle w:val="Bibliography"/>
@@ -29544,7 +29603,7 @@
       <w:r>
         <w:t xml:space="preserve"> </w:t>
       </w:r>
-      <w:hyperlink r:id="rId294">
+      <w:hyperlink r:id="rId295">
         <w:r>
           <w:rPr>
             <w:rStyle w:val="Hyperlink"/>
@@ -29556,8 +29615,8 @@
         <w:t xml:space="preserve">.</w:t>
       </w:r>
     </w:p>
-    <w:bookmarkEnd w:id="295"/>
-    <w:bookmarkStart w:id="296" w:name="ref-kimaki"/>
+    <w:bookmarkEnd w:id="296"/>
+    <w:bookmarkStart w:id="297" w:name="ref-kimaki"/>
     <w:p>
       <w:pPr>
         <w:pStyle w:val="Bibliography"/>
@@ -29584,7 +29643,7 @@
       <w:r>
         <w:t xml:space="preserve"> </w:t>
       </w:r>
-      <w:hyperlink r:id="rId170">
+      <w:hyperlink r:id="rId171">
         <w:r>
           <w:rPr>
             <w:rStyle w:val="Hyperlink"/>
@@ -29596,8 +29655,8 @@
         <w:t xml:space="preserve">.</w:t>
       </w:r>
     </w:p>
-    <w:bookmarkEnd w:id="296"/>
-    <w:bookmarkStart w:id="297" w:name="ref-langchain_custom_harness"/>
+    <w:bookmarkEnd w:id="297"/>
+    <w:bookmarkStart w:id="298" w:name="ref-langchain_custom_harness"/>
     <w:p>
       <w:pPr>
         <w:pStyle w:val="Bibliography"/>
@@ -29633,8 +29692,8 @@
         <w:t xml:space="preserve">.</w:t>
       </w:r>
     </w:p>
-    <w:bookmarkEnd w:id="297"/>
-    <w:bookmarkStart w:id="298" w:name="ref-hoyeon"/>
+    <w:bookmarkEnd w:id="298"/>
+    <w:bookmarkStart w:id="299" w:name="ref-hoyeon"/>
     <w:p>
       <w:pPr>
         <w:pStyle w:val="Bibliography"/>
@@ -29673,8 +29732,8 @@
         <w:t xml:space="preserve">.</w:t>
       </w:r>
     </w:p>
-    <w:bookmarkEnd w:id="298"/>
-    <w:bookmarkStart w:id="299" w:name="ref-superpowers"/>
+    <w:bookmarkEnd w:id="299"/>
+    <w:bookmarkStart w:id="300" w:name="ref-superpowers"/>
     <w:p>
       <w:pPr>
         <w:pStyle w:val="Bibliography"/>
@@ -29710,8 +29769,8 @@
         <w:t xml:space="preserve">.</w:t>
       </w:r>
     </w:p>
-    <w:bookmarkEnd w:id="299"/>
-    <w:bookmarkStart w:id="301" w:name="ref-voltagent_agents"/>
+    <w:bookmarkEnd w:id="300"/>
+    <w:bookmarkStart w:id="302" w:name="ref-voltagent_agents"/>
     <w:p>
       <w:pPr>
         <w:pStyle w:val="Bibliography"/>
@@ -29735,7 +29794,7 @@
       <w:r>
         <w:t xml:space="preserve"> </w:t>
       </w:r>
-      <w:hyperlink r:id="rId300">
+      <w:hyperlink r:id="rId301">
         <w:r>
           <w:rPr>
             <w:rStyle w:val="Hyperlink"/>
@@ -29747,8 +29806,8 @@
         <w:t xml:space="preserve">.</w:t>
       </w:r>
     </w:p>
-    <w:bookmarkEnd w:id="301"/>
-    <w:bookmarkStart w:id="303" w:name="ref-voltagent_memory"/>
+    <w:bookmarkEnd w:id="302"/>
+    <w:bookmarkStart w:id="304" w:name="ref-voltagent_memory"/>
     <w:p>
       <w:pPr>
         <w:pStyle w:val="Bibliography"/>
@@ -29772,7 +29831,7 @@
       <w:r>
         <w:t xml:space="preserve"> </w:t>
       </w:r>
-      <w:hyperlink r:id="rId302">
+      <w:hyperlink r:id="rId303">
         <w:r>
           <w:rPr>
             <w:rStyle w:val="Hyperlink"/>
@@ -29784,8 +29843,8 @@
         <w:t xml:space="preserve">.</w:t>
       </w:r>
     </w:p>
-    <w:bookmarkEnd w:id="303"/>
-    <w:bookmarkStart w:id="305" w:name="ref-voltagent_observability"/>
+    <w:bookmarkEnd w:id="304"/>
+    <w:bookmarkStart w:id="306" w:name="ref-voltagent_observability"/>
     <w:p>
       <w:pPr>
         <w:pStyle w:val="Bibliography"/>
@@ -29809,7 +29868,7 @@
       <w:r>
         <w:t xml:space="preserve"> </w:t>
       </w:r>
-      <w:hyperlink r:id="rId304">
+      <w:hyperlink r:id="rId305">
         <w:r>
           <w:rPr>
             <w:rStyle w:val="Hyperlink"/>
@@ -29821,8 +29880,8 @@
         <w:t xml:space="preserve">.</w:t>
       </w:r>
     </w:p>
-    <w:bookmarkEnd w:id="305"/>
-    <w:bookmarkStart w:id="307" w:name="ref-voltagent_subagents"/>
+    <w:bookmarkEnd w:id="306"/>
+    <w:bookmarkStart w:id="308" w:name="ref-voltagent_subagents"/>
     <w:p>
       <w:pPr>
         <w:pStyle w:val="Bibliography"/>
@@ -29846,7 +29905,7 @@
       <w:r>
         <w:t xml:space="preserve"> </w:t>
       </w:r>
-      <w:hyperlink r:id="rId306">
+      <w:hyperlink r:id="rId307">
         <w:r>
           <w:rPr>
             <w:rStyle w:val="Hyperlink"/>
@@ -29858,8 +29917,8 @@
         <w:t xml:space="preserve">.</w:t>
       </w:r>
     </w:p>
-    <w:bookmarkEnd w:id="307"/>
-    <w:bookmarkStart w:id="309" w:name="ref-voltagent_console"/>
+    <w:bookmarkEnd w:id="308"/>
+    <w:bookmarkStart w:id="310" w:name="ref-voltagent_console"/>
     <w:p>
       <w:pPr>
         <w:pStyle w:val="Bibliography"/>
@@ -29883,7 +29942,7 @@
       <w:r>
         <w:t xml:space="preserve"> </w:t>
       </w:r>
-      <w:hyperlink r:id="rId308">
+      <w:hyperlink r:id="rId309">
         <w:r>
           <w:rPr>
             <w:rStyle w:val="Hyperlink"/>
@@ -29895,8 +29954,8 @@
         <w:t xml:space="preserve">.</w:t>
       </w:r>
     </w:p>
-    <w:bookmarkEnd w:id="309"/>
-    <w:bookmarkStart w:id="311" w:name="ref-voltagent_workflows"/>
+    <w:bookmarkEnd w:id="310"/>
+    <w:bookmarkStart w:id="312" w:name="ref-voltagent_workflows"/>
     <w:p>
       <w:pPr>
         <w:pStyle w:val="Bibliography"/>
@@ -29920,7 +29979,7 @@
       <w:r>
         <w:t xml:space="preserve"> </w:t>
       </w:r>
-      <w:hyperlink r:id="rId310">
+      <w:hyperlink r:id="rId311">
         <w:r>
           <w:rPr>
             <w:rStyle w:val="Hyperlink"/>
@@ -29932,8 +29991,8 @@
         <w:t xml:space="preserve">.</w:t>
       </w:r>
     </w:p>
-    <w:bookmarkEnd w:id="311"/>
-    <w:bookmarkStart w:id="312" w:name="ref-voltagent_repo"/>
+    <w:bookmarkEnd w:id="312"/>
+    <w:bookmarkStart w:id="313" w:name="ref-voltagent_repo"/>
     <w:p>
       <w:pPr>
         <w:pStyle w:val="Bibliography"/>
@@ -29957,7 +30016,7 @@
       <w:r>
         <w:t xml:space="preserve"> </w:t>
       </w:r>
-      <w:hyperlink r:id="rId183">
+      <w:hyperlink r:id="rId184">
         <w:r>
           <w:rPr>
             <w:rStyle w:val="Hyperlink"/>
@@ -29969,8 +30028,8 @@
         <w:t xml:space="preserve">.</w:t>
       </w:r>
     </w:p>
-    <w:bookmarkEnd w:id="312"/>
-    <w:bookmarkStart w:id="314" w:name="ref-voltagent_pricing"/>
+    <w:bookmarkEnd w:id="313"/>
+    <w:bookmarkStart w:id="315" w:name="ref-voltagent_pricing"/>
     <w:p>
       <w:pPr>
         <w:pStyle w:val="Bibliography"/>
@@ -29994,7 +30053,7 @@
       <w:r>
         <w:t xml:space="preserve"> </w:t>
       </w:r>
-      <w:hyperlink r:id="rId313">
+      <w:hyperlink r:id="rId314">
         <w:r>
           <w:rPr>
             <w:rStyle w:val="Hyperlink"/>
@@ -30006,8 +30065,8 @@
         <w:t xml:space="preserve">.</w:t>
       </w:r>
     </w:p>
-    <w:bookmarkEnd w:id="314"/>
-    <w:bookmarkStart w:id="316" w:name="ref-tengu_decoded"/>
+    <w:bookmarkEnd w:id="315"/>
+    <w:bookmarkStart w:id="317" w:name="ref-tengu_decoded"/>
     <w:p>
       <w:pPr>
         <w:pStyle w:val="Bibliography"/>
@@ -30034,7 +30093,7 @@
       <w:r>
         <w:t xml:space="preserve"> </w:t>
       </w:r>
-      <w:hyperlink r:id="rId315">
+      <w:hyperlink r:id="rId316">
         <w:r>
           <w:rPr>
             <w:rStyle w:val="Hyperlink"/>
@@ -30046,9 +30105,9 @@
         <w:t xml:space="preserve">.</w:t>
       </w:r>
     </w:p>
-    <w:bookmarkEnd w:id="316"/>
     <w:bookmarkEnd w:id="317"/>
     <w:bookmarkEnd w:id="318"/>
+    <w:bookmarkEnd w:id="319"/>
     <w:sectPr>
       <w:footnotePr>
         <w:numRestart w:val="eachSect"/>

</xml_diff>